<commit_message>
Update 4-Add Special Effects to Existing Audio.docx
</commit_message>
<xml_diff>
--- a/Unit 5 - Audio/4-Add Special Effects to Existing Audio.docx
+++ b/Unit 5 - Audio/4-Add Special Effects to Existing Audio.docx
@@ -1,6 +1,6 @@
 
 <file path=word/document.xml><?xml version="1.0" encoding="utf-8"?>
-<w:document xmlns:wpc="http://schemas.microsoft.com/office/word/2010/wordprocessingCanvas" xmlns:cx="http://schemas.microsoft.com/office/drawing/2014/chartex" xmlns:cx1="http://schemas.microsoft.com/office/drawing/2015/9/8/chartex" xmlns:cx2="http://schemas.microsoft.com/office/drawing/2015/10/21/chartex" xmlns:cx3="http://schemas.microsoft.com/office/drawing/2016/5/9/chartex" xmlns:cx4="http://schemas.microsoft.com/office/drawing/2016/5/10/chartex" xmlns:cx5="http://schemas.microsoft.com/office/drawing/2016/5/11/chartex" xmlns:cx6="http://schemas.microsoft.com/office/drawing/2016/5/12/chartex" xmlns:cx7="http://schemas.microsoft.com/office/drawing/2016/5/13/chartex" xmlns:cx8="http://schemas.microsoft.com/office/drawing/2016/5/14/chartex" xmlns:mc="http://schemas.openxmlformats.org/markup-compatibility/2006" xmlns:m="http://schemas.openxmlformats.org/officeDocument/2006/math" xmlns:aink="http://schemas.microsoft.com/office/drawing/2016/ink" xmlns:am3d="http://schemas.microsoft.com/office/drawing/2017/model3d" xmlns:oel="http://schemas.microsoft.com/office/2019/extlst" xmlns:r="http://schemas.openxmlformats.org/officeDocument/2006/relationships" xmlns:wp14="http://schemas.microsoft.com/office/word/2010/wordprocessingDrawing" xmlns:wp="http://schemas.openxmlformats.org/drawingml/2006/wordprocessingDrawing" xmlns:wpg="http://schemas.microsoft.com/office/word/2010/wordprocessingGroup" xmlns:wpi="http://schemas.microsoft.com/office/word/2010/wordprocessingInk" xmlns:wps="http://schemas.microsoft.com/office/word/2010/wordprocessingShape" xmlns:o="urn:schemas-microsoft-com:office:office" xmlns:v="urn:schemas-microsoft-com:vml" xmlns:w10="urn:schemas-microsoft-com:office:word" xmlns:w="http://schemas.openxmlformats.org/wordprocessingml/2006/main" xmlns:w14="http://schemas.microsoft.com/office/word/2010/wordml" xmlns:w15="http://schemas.microsoft.com/office/word/2012/wordml" xmlns:w16cex="http://schemas.microsoft.com/office/word/2018/wordml/cex" xmlns:w16cid="http://schemas.microsoft.com/office/word/2016/wordml/cid" xmlns:w16="http://schemas.microsoft.com/office/word/2018/wordml" xmlns:w16sdtdh="http://schemas.microsoft.com/office/word/2020/wordml/sdtdatahash" xmlns:w16sdtfl="http://schemas.microsoft.com/office/word/2024/wordml/sdtformatlock" xmlns:w16se="http://schemas.microsoft.com/office/word/2015/wordml/symex" xmlns:w16du="http://schemas.microsoft.com/office/word/2023/wordml/word16du" xmlns:wne="http://schemas.microsoft.com/office/word/2006/wordml" mc:Ignorable="w14 w15 w16se w16cid w16 w16cex w16sdtdh w16sdtfl w16du wp14">
+<w:document xmlns:wpc="http://schemas.microsoft.com/office/word/2010/wordprocessingCanvas" xmlns:cx="http://schemas.microsoft.com/office/drawing/2014/chartex" xmlns:cx1="http://schemas.microsoft.com/office/drawing/2015/9/8/chartex" xmlns:cx2="http://schemas.microsoft.com/office/drawing/2015/10/21/chartex" xmlns:cx3="http://schemas.microsoft.com/office/drawing/2016/5/9/chartex" xmlns:cx4="http://schemas.microsoft.com/office/drawing/2016/5/10/chartex" xmlns:cx5="http://schemas.microsoft.com/office/drawing/2016/5/11/chartex" xmlns:cx6="http://schemas.microsoft.com/office/drawing/2016/5/12/chartex" xmlns:cx7="http://schemas.microsoft.com/office/drawing/2016/5/13/chartex" xmlns:cx8="http://schemas.microsoft.com/office/drawing/2016/5/14/chartex" xmlns:mc="http://schemas.openxmlformats.org/markup-compatibility/2006" xmlns:aink="http://schemas.microsoft.com/office/drawing/2016/ink" xmlns:am3d="http://schemas.microsoft.com/office/drawing/2017/model3d" xmlns:o="urn:schemas-microsoft-com:office:office" xmlns:oel="http://schemas.microsoft.com/office/2019/extlst" xmlns:r="http://schemas.openxmlformats.org/officeDocument/2006/relationships" xmlns:m="http://schemas.openxmlformats.org/officeDocument/2006/math" xmlns:v="urn:schemas-microsoft-com:vml" xmlns:wp14="http://schemas.microsoft.com/office/word/2010/wordprocessingDrawing" xmlns:wp="http://schemas.openxmlformats.org/drawingml/2006/wordprocessingDrawing" xmlns:w10="urn:schemas-microsoft-com:office:word" xmlns:w="http://schemas.openxmlformats.org/wordprocessingml/2006/main" xmlns:w14="http://schemas.microsoft.com/office/word/2010/wordml" xmlns:w15="http://schemas.microsoft.com/office/word/2012/wordml" xmlns:w16cex="http://schemas.microsoft.com/office/word/2018/wordml/cex" xmlns:w16cid="http://schemas.microsoft.com/office/word/2016/wordml/cid" xmlns:w16="http://schemas.microsoft.com/office/word/2018/wordml" xmlns:w16du="http://schemas.microsoft.com/office/word/2023/wordml/word16du" xmlns:w16sdtdh="http://schemas.microsoft.com/office/word/2020/wordml/sdtdatahash" xmlns:w16sdtfl="http://schemas.microsoft.com/office/word/2024/wordml/sdtformatlock" xmlns:w16se="http://schemas.microsoft.com/office/word/2015/wordml/symex" xmlns:wpg="http://schemas.microsoft.com/office/word/2010/wordprocessingGroup" xmlns:wpi="http://schemas.microsoft.com/office/word/2010/wordprocessingInk" xmlns:wne="http://schemas.microsoft.com/office/word/2006/wordml" xmlns:wps="http://schemas.microsoft.com/office/word/2010/wordprocessingShape" mc:Ignorable="w14 w15 w16se w16cid w16 w16cex w16sdtdh w16sdtfl w16du wp14">
   <w:body>
     <w:p>
       <w:pPr>
@@ -14,6 +14,134 @@
           <w:b/>
           <w:bCs/>
         </w:rPr>
+        <w:t xml:space="preserve">In this </w:t>
+      </w:r>
+      <w:r>
+        <w:rPr>
+          <w:b/>
+          <w:bCs/>
+        </w:rPr>
+        <w:t>lab</w:t>
+      </w:r>
+      <w:r>
+        <w:rPr>
+          <w:b/>
+          <w:bCs/>
+        </w:rPr>
+        <w:t>, you’ll create an echo effect using an audio reverb zone.</w:t>
+      </w:r>
+    </w:p>
+    <w:p>
+      <w:pPr>
+        <w:rPr>
+          <w:b/>
+          <w:bCs/>
+        </w:rPr>
+      </w:pPr>
+      <w:r>
+        <w:rPr>
+          <w:b/>
+          <w:bCs/>
+        </w:rPr>
+        <w:t>By the end of this tutorial, you'll be able to:</w:t>
+      </w:r>
+    </w:p>
+    <w:p>
+      <w:pPr>
+        <w:numPr>
+          <w:ilvl w:val="0"/>
+          <w:numId w:val="1"/>
+        </w:numPr>
+        <w:rPr>
+          <w:b/>
+          <w:bCs/>
+        </w:rPr>
+      </w:pPr>
+      <w:r>
+        <w:rPr>
+          <w:b/>
+          <w:bCs/>
+        </w:rPr>
+        <w:t>Add special audio effects to a scene</w:t>
+      </w:r>
+    </w:p>
+    <w:p>
+      <w:pPr>
+        <w:numPr>
+          <w:ilvl w:val="0"/>
+          <w:numId w:val="1"/>
+        </w:numPr>
+        <w:rPr>
+          <w:b/>
+          <w:bCs/>
+        </w:rPr>
+      </w:pPr>
+      <w:r>
+        <w:rPr>
+          <w:b/>
+          <w:bCs/>
+        </w:rPr>
+        <w:t>Describe the science of audio in digital environments.</w:t>
+      </w:r>
+    </w:p>
+    <w:p>
+      <w:pPr>
+        <w:numPr>
+          <w:ilvl w:val="0"/>
+          <w:numId w:val="1"/>
+        </w:numPr>
+        <w:rPr>
+          <w:b/>
+          <w:bCs/>
+        </w:rPr>
+      </w:pPr>
+      <w:r>
+        <w:rPr>
+          <w:b/>
+          <w:bCs/>
+        </w:rPr>
+        <w:t>Explain the role of audio in developing atmosphere.</w:t>
+      </w:r>
+    </w:p>
+    <w:p>
+      <w:pPr>
+        <w:numPr>
+          <w:ilvl w:val="0"/>
+          <w:numId w:val="1"/>
+        </w:numPr>
+        <w:rPr>
+          <w:b/>
+          <w:bCs/>
+        </w:rPr>
+      </w:pPr>
+      <w:r>
+        <w:rPr>
+          <w:b/>
+          <w:bCs/>
+        </w:rPr>
+        <w:t>Control the priority of different audio sources in a scene by setting Priority settings.</w:t>
+      </w:r>
+    </w:p>
+    <w:p>
+      <w:pPr>
+        <w:rPr>
+          <w:b/>
+          <w:bCs/>
+        </w:rPr>
+      </w:pPr>
+    </w:p>
+    <w:p>
+      <w:pPr>
+        <w:rPr>
+          <w:b/>
+          <w:bCs/>
+        </w:rPr>
+      </w:pPr>
+      <w:r>
+        <w:rPr>
+          <w:b/>
+          <w:bCs/>
+        </w:rPr>
         <w:t>1. Overview</w:t>
       </w:r>
     </w:p>
@@ -54,15 +182,7 @@
     </w:p>
     <w:p>
       <w:r>
-        <w:t xml:space="preserve">Sound waves, just like </w:t>
-      </w:r>
-      <w:proofErr w:type="spellStart"/>
-      <w:r>
-        <w:t>lightwaves</w:t>
-      </w:r>
-      <w:proofErr w:type="spellEnd"/>
-      <w:r>
-        <w:t>, always interact with whatever environment they’re in. In the presence of soft materials and variant surface depths, sound is quickly absorbed. On the opposite end of the spectrum, hard, flat surfaces readily reflect sound waves, which produce echoes.</w:t>
+        <w:t>Sound waves, just like lightwaves, always interact with whatever environment they’re in. In the presence of soft materials and variant surface depths, sound is quickly absorbed. On the opposite end of the spectrum, hard, flat surfaces readily reflect sound waves, which produce echoes.</w:t>
       </w:r>
     </w:p>
     <w:p>
@@ -88,7 +208,7 @@
                     </pic:cNvPicPr>
                   </pic:nvPicPr>
                   <pic:blipFill>
-                    <a:blip r:embed="rId4" cstate="print">
+                    <a:blip r:embed="rId5" cstate="print">
                       <a:extLst>
                         <a:ext uri="{28A0092B-C50C-407E-A947-70E740481C1C}">
                           <a14:useLocalDpi xmlns:a14="http://schemas.microsoft.com/office/drawing/2010/main" val="0"/>
@@ -122,6 +242,7 @@
     </w:p>
     <w:p>
       <w:r>
+        <w:lastRenderedPageBreak/>
         <w:t>The cave in the scene is a small space made entirely out of stone. In this case, echoing would absolutely be occurring.</w:t>
       </w:r>
     </w:p>
@@ -172,7 +293,6 @@
           <w:b/>
           <w:bCs/>
         </w:rPr>
-        <w:lastRenderedPageBreak/>
         <w:t>3. Create a reverb zone</w:t>
       </w:r>
     </w:p>
@@ -260,7 +380,7 @@
                     </pic:cNvPicPr>
                   </pic:nvPicPr>
                   <pic:blipFill>
-                    <a:blip r:embed="rId5">
+                    <a:blip r:embed="rId6">
                       <a:extLst>
                         <a:ext uri="{28A0092B-C50C-407E-A947-70E740481C1C}">
                           <a14:useLocalDpi xmlns:a14="http://schemas.microsoft.com/office/drawing/2010/main" val="0"/>
@@ -343,6 +463,7 @@
     </w:p>
     <w:p>
       <w:r>
+        <w:lastRenderedPageBreak/>
         <w:t>The player character’s footsteps now echo. To hear this more distinctly, while still in Play mode, disable the reverb zone by disabling the box next to the reverb zone’s name and take a few steps. Enable it again and take a few more steps. Notice that in addition to the footsteps echoing, the pitch of the waterfall shifts in the cave as well.</w:t>
       </w:r>
     </w:p>
@@ -365,88 +486,175 @@
     <w:p/>
     <w:p>
       <w:r>
+        <w:t xml:space="preserve">There </w:t>
+      </w:r>
+      <w:proofErr w:type="gramStart"/>
+      <w:r>
+        <w:t>are</w:t>
+      </w:r>
+      <w:proofErr w:type="gramEnd"/>
+      <w:r>
+        <w:t xml:space="preserve"> a large selection of Reverb Presets to choose from, and you can even create your own custom user generated preset as well. Explore the different presets to see how they change the overall mood and believability of the cave.</w:t>
+      </w:r>
+    </w:p>
+    <w:p>
+      <w:r>
+        <w:rPr>
+          <w:b/>
+          <w:bCs/>
+        </w:rPr>
+        <w:t>1.</w:t>
+      </w:r>
+      <w:r>
+        <w:t> Set the Reverb Preset to </w:t>
+      </w:r>
+      <w:r>
+        <w:rPr>
+          <w:b/>
+          <w:bCs/>
+        </w:rPr>
+        <w:t>Padded Cell.</w:t>
+      </w:r>
+    </w:p>
+    <w:p>
+      <w:r>
+        <w:t xml:space="preserve">The echo is </w:t>
+      </w:r>
+      <w:proofErr w:type="gramStart"/>
+      <w:r>
+        <w:t>completely eliminated</w:t>
+      </w:r>
+      <w:proofErr w:type="gramEnd"/>
+      <w:r>
+        <w:t>, and the footsteps seem to be dampened compared to how they sound outside of the reverb zone.</w:t>
+      </w:r>
+    </w:p>
+    <w:p>
+      <w:r>
+        <w:rPr>
+          <w:b/>
+          <w:bCs/>
+        </w:rPr>
+        <w:t>2.</w:t>
+      </w:r>
+      <w:r>
+        <w:t> Next, try </w:t>
+      </w:r>
+      <w:r>
+        <w:rPr>
+          <w:b/>
+          <w:bCs/>
+        </w:rPr>
+        <w:t>Stone Corridor</w:t>
+      </w:r>
+      <w:r>
+        <w:t>.</w:t>
+      </w:r>
+    </w:p>
+    <w:p>
+      <w:r>
+        <w:t xml:space="preserve">Like the cave preset, the stone corridor has a lot of </w:t>
+      </w:r>
+      <w:proofErr w:type="gramStart"/>
+      <w:r>
+        <w:t>echo</w:t>
+      </w:r>
+      <w:proofErr w:type="gramEnd"/>
+      <w:r>
+        <w:t>, but those echoes are sharper and last longer. This is because a corridor is generally expected to be narrower and perhaps even taller, giving more opportunities for the sound waves to bounce around before reaching the player character’s ears.</w:t>
+      </w:r>
+    </w:p>
+    <w:p>
+      <w:r>
+        <w:t>Try reviewing a few other presets and think about why the effect changes the audio in the ways that it does. If you find a setting that you think suits the cave better, feel free to use it; otherwise, when you’re finished, switch the preset back to cave.</w:t>
+      </w:r>
+    </w:p>
+    <w:p/>
+    <w:p>
+      <w:pPr>
+        <w:rPr>
+          <w:b/>
+          <w:bCs/>
+        </w:rPr>
+      </w:pPr>
+      <w:r>
+        <w:rPr>
+          <w:b/>
+          <w:bCs/>
+        </w:rPr>
+        <w:t>5. Add a water drop sound effect</w:t>
+      </w:r>
+    </w:p>
+    <w:p/>
+    <w:p>
+      <w:r>
+        <w:t>Let’s add an extra level of detail to the interior of the cave by adding some extra ambient water sounds. These will only be audible inside the cave itself and will reflect the fact that the cave is behind the waterfall.</w:t>
+      </w:r>
+    </w:p>
+    <w:p>
+      <w:r>
+        <w:rPr>
+          <w:b/>
+          <w:bCs/>
+        </w:rPr>
+        <w:t>1. </w:t>
+      </w:r>
+      <w:r>
+        <w:t>Create a new Audio Source and name it “Cave Water Drops”.</w:t>
+      </w:r>
+    </w:p>
+    <w:p>
+      <w:r>
+        <w:rPr>
+          <w:b/>
+          <w:bCs/>
+        </w:rPr>
+        <w:t>2.</w:t>
+      </w:r>
+      <w:r>
+        <w:t> Add the WaterDroplets audio clip to the audio source.</w:t>
+      </w:r>
+    </w:p>
+    <w:p>
+      <w:r>
+        <w:rPr>
+          <w:b/>
+          <w:bCs/>
+        </w:rPr>
+        <w:t>3.</w:t>
+      </w:r>
+      <w:r>
+        <w:t> Set the Spatial Blend to 3D.</w:t>
+      </w:r>
+    </w:p>
+    <w:p>
+      <w:r>
+        <w:rPr>
+          <w:b/>
+          <w:bCs/>
+        </w:rPr>
+        <w:t>4.</w:t>
+      </w:r>
+      <w:r>
+        <w:t> Set the Volume Rolloff to Linear.</w:t>
+      </w:r>
+    </w:p>
+    <w:p>
+      <w:r>
+        <w:t>The water drops will only be able to be heard within the cave itself, and the sound of the waterfall will be competing with the drops. Because of this, it’s less important to worry about the volume rolloff.</w:t>
+      </w:r>
+    </w:p>
+    <w:p>
+      <w:r>
+        <w:rPr>
+          <w:b/>
+          <w:bCs/>
+        </w:rPr>
         <w:lastRenderedPageBreak/>
-        <w:t xml:space="preserve">There </w:t>
-      </w:r>
-      <w:proofErr w:type="gramStart"/>
-      <w:r>
-        <w:t>are</w:t>
-      </w:r>
-      <w:proofErr w:type="gramEnd"/>
-      <w:r>
-        <w:t xml:space="preserve"> a large selection of Reverb Presets to choose from, and you can even create your own custom user generated preset as well. Explore the different presets to see how they change the overall mood and believability of the cave.</w:t>
-      </w:r>
-    </w:p>
-    <w:p>
-      <w:r>
-        <w:rPr>
-          <w:b/>
-          <w:bCs/>
-        </w:rPr>
-        <w:t>1.</w:t>
-      </w:r>
-      <w:r>
-        <w:t> Set the Reverb Preset to </w:t>
-      </w:r>
-      <w:r>
-        <w:rPr>
-          <w:b/>
-          <w:bCs/>
-        </w:rPr>
-        <w:t>Padded Cell.</w:t>
-      </w:r>
-    </w:p>
-    <w:p>
-      <w:r>
-        <w:t xml:space="preserve">The echo is </w:t>
-      </w:r>
-      <w:proofErr w:type="gramStart"/>
-      <w:r>
-        <w:t>completely eliminated</w:t>
-      </w:r>
-      <w:proofErr w:type="gramEnd"/>
-      <w:r>
-        <w:t>, and the footsteps seem to be dampened compared to how they sound outside of the reverb zone.</w:t>
-      </w:r>
-    </w:p>
-    <w:p>
-      <w:r>
-        <w:rPr>
-          <w:b/>
-          <w:bCs/>
-        </w:rPr>
-        <w:t>2.</w:t>
-      </w:r>
-      <w:r>
-        <w:t> Next, try </w:t>
-      </w:r>
-      <w:r>
-        <w:rPr>
-          <w:b/>
-          <w:bCs/>
-        </w:rPr>
-        <w:t>Stone Corridor</w:t>
-      </w:r>
-      <w:r>
-        <w:t>.</w:t>
-      </w:r>
-    </w:p>
-    <w:p>
-      <w:r>
-        <w:t xml:space="preserve">Like the cave preset, the stone corridor has a lot of </w:t>
-      </w:r>
-      <w:proofErr w:type="gramStart"/>
-      <w:r>
-        <w:t>echo</w:t>
-      </w:r>
-      <w:proofErr w:type="gramEnd"/>
-      <w:r>
-        <w:t>, but those echoes are sharper and last longer. This is because a corridor is generally expected to be narrower and perhaps even taller, giving more opportunities for the sound waves to bounce around before reaching the player character’s ears.</w:t>
-      </w:r>
-    </w:p>
-    <w:p>
-      <w:r>
-        <w:t>Try reviewing a few other presets and think about why the effect changes the audio in the ways that it does. If you find a setting that you think suits the cave better, feel free to use it; otherwise, when you’re finished, switch the preset back to cave.</w:t>
+        <w:t>5.</w:t>
+      </w:r>
+      <w:r>
+        <w:t> Set the minimum and maximum distance to fill the interior of the cave. It’s fine to keep the two relatively close to one another in this case.</w:t>
       </w:r>
     </w:p>
     <w:p/>
@@ -462,116 +670,12 @@
           <w:b/>
           <w:bCs/>
         </w:rPr>
-        <w:t>5. Add a water drop sound effect</w:t>
+        <w:t>6. Set audio importance</w:t>
       </w:r>
     </w:p>
     <w:p/>
     <w:p>
       <w:r>
-        <w:t>Let’s add an extra level of detail to the interior of the cave by adding some extra ambient water sounds. These will only be audible inside the cave itself and will reflect the fact that the cave is behind the waterfall.</w:t>
-      </w:r>
-    </w:p>
-    <w:p>
-      <w:r>
-        <w:rPr>
-          <w:b/>
-          <w:bCs/>
-        </w:rPr>
-        <w:t>1. </w:t>
-      </w:r>
-      <w:r>
-        <w:t>Create a new Audio Source and name it “Cave Water Drops”.</w:t>
-      </w:r>
-    </w:p>
-    <w:p>
-      <w:r>
-        <w:rPr>
-          <w:b/>
-          <w:bCs/>
-        </w:rPr>
-        <w:t>2.</w:t>
-      </w:r>
-      <w:r>
-        <w:t xml:space="preserve"> Add the </w:t>
-      </w:r>
-      <w:proofErr w:type="spellStart"/>
-      <w:r>
-        <w:t>WaterDroplets</w:t>
-      </w:r>
-      <w:proofErr w:type="spellEnd"/>
-      <w:r>
-        <w:t xml:space="preserve"> audio clip to the audio source.</w:t>
-      </w:r>
-    </w:p>
-    <w:p>
-      <w:r>
-        <w:rPr>
-          <w:b/>
-          <w:bCs/>
-        </w:rPr>
-        <w:t>3.</w:t>
-      </w:r>
-      <w:r>
-        <w:t> Set the Spatial Blend to 3D.</w:t>
-      </w:r>
-    </w:p>
-    <w:p>
-      <w:r>
-        <w:rPr>
-          <w:b/>
-          <w:bCs/>
-        </w:rPr>
-        <w:t>4.</w:t>
-      </w:r>
-      <w:r>
-        <w:t> Set the Volume Rolloff to Linear.</w:t>
-      </w:r>
-    </w:p>
-    <w:p>
-      <w:r>
-        <w:t xml:space="preserve">The water drops will only be able to be heard within the cave itself, and the sound of the waterfall will be competing with the drops. Because of this, it’s less important to worry about the volume </w:t>
-      </w:r>
-      <w:proofErr w:type="spellStart"/>
-      <w:r>
-        <w:t>rolloff</w:t>
-      </w:r>
-      <w:proofErr w:type="spellEnd"/>
-      <w:r>
-        <w:t>.</w:t>
-      </w:r>
-    </w:p>
-    <w:p>
-      <w:r>
-        <w:rPr>
-          <w:b/>
-          <w:bCs/>
-        </w:rPr>
-        <w:t>5.</w:t>
-      </w:r>
-      <w:r>
-        <w:t> Set the minimum and maximum distance to fill the interior of the cave. It’s fine to keep the two relatively close to one another in this case.</w:t>
-      </w:r>
-    </w:p>
-    <w:p/>
-    <w:p>
-      <w:pPr>
-        <w:rPr>
-          <w:b/>
-          <w:bCs/>
-        </w:rPr>
-      </w:pPr>
-      <w:r>
-        <w:rPr>
-          <w:b/>
-          <w:bCs/>
-        </w:rPr>
-        <w:t>6. Set audio importance</w:t>
-      </w:r>
-    </w:p>
-    <w:p/>
-    <w:p>
-      <w:r>
-        <w:lastRenderedPageBreak/>
         <w:t>As you have learned, multiple audio sources can be layered on top of each other to create a more dynamic soundscape in a scene. However, sometimes when this occurs some audio sources can be lost over others or are deprioritized.</w:t>
       </w:r>
     </w:p>
@@ -671,8 +775,165 @@
 </w:document>
 </file>
 
+<file path=word/numbering.xml><?xml version="1.0" encoding="utf-8"?>
+<w:numbering xmlns:wpc="http://schemas.microsoft.com/office/word/2010/wordprocessingCanvas" xmlns:cx="http://schemas.microsoft.com/office/drawing/2014/chartex" xmlns:cx1="http://schemas.microsoft.com/office/drawing/2015/9/8/chartex" xmlns:cx2="http://schemas.microsoft.com/office/drawing/2015/10/21/chartex" xmlns:cx3="http://schemas.microsoft.com/office/drawing/2016/5/9/chartex" xmlns:cx4="http://schemas.microsoft.com/office/drawing/2016/5/10/chartex" xmlns:cx5="http://schemas.microsoft.com/office/drawing/2016/5/11/chartex" xmlns:cx6="http://schemas.microsoft.com/office/drawing/2016/5/12/chartex" xmlns:cx7="http://schemas.microsoft.com/office/drawing/2016/5/13/chartex" xmlns:cx8="http://schemas.microsoft.com/office/drawing/2016/5/14/chartex" xmlns:mc="http://schemas.openxmlformats.org/markup-compatibility/2006" xmlns:aink="http://schemas.microsoft.com/office/drawing/2016/ink" xmlns:am3d="http://schemas.microsoft.com/office/drawing/2017/model3d" xmlns:o="urn:schemas-microsoft-com:office:office" xmlns:oel="http://schemas.microsoft.com/office/2019/extlst" xmlns:r="http://schemas.openxmlformats.org/officeDocument/2006/relationships" xmlns:m="http://schemas.openxmlformats.org/officeDocument/2006/math" xmlns:v="urn:schemas-microsoft-com:vml" xmlns:wp14="http://schemas.microsoft.com/office/word/2010/wordprocessingDrawing" xmlns:wp="http://schemas.openxmlformats.org/drawingml/2006/wordprocessingDrawing" xmlns:w10="urn:schemas-microsoft-com:office:word" xmlns:w="http://schemas.openxmlformats.org/wordprocessingml/2006/main" xmlns:w14="http://schemas.microsoft.com/office/word/2010/wordml" xmlns:w15="http://schemas.microsoft.com/office/word/2012/wordml" xmlns:w16cex="http://schemas.microsoft.com/office/word/2018/wordml/cex" xmlns:w16cid="http://schemas.microsoft.com/office/word/2016/wordml/cid" xmlns:w16="http://schemas.microsoft.com/office/word/2018/wordml" xmlns:w16du="http://schemas.microsoft.com/office/word/2023/wordml/word16du" xmlns:w16sdtdh="http://schemas.microsoft.com/office/word/2020/wordml/sdtdatahash" xmlns:w16sdtfl="http://schemas.microsoft.com/office/word/2024/wordml/sdtformatlock" xmlns:w16se="http://schemas.microsoft.com/office/word/2015/wordml/symex" xmlns:wpg="http://schemas.microsoft.com/office/word/2010/wordprocessingGroup" xmlns:wpi="http://schemas.microsoft.com/office/word/2010/wordprocessingInk" xmlns:wne="http://schemas.microsoft.com/office/word/2006/wordml" xmlns:wps="http://schemas.microsoft.com/office/word/2010/wordprocessingShape" mc:Ignorable="w14 w15 w16se w16cid w16 w16cex w16sdtdh w16sdtfl w16du wp14">
+  <w:abstractNum w:abstractNumId="0" w15:restartNumberingAfterBreak="0">
+    <w:nsid w:val="5EEE27E7"/>
+    <w:multiLevelType w:val="multilevel"/>
+    <w:tmpl w:val="0E867E7E"/>
+    <w:lvl w:ilvl="0">
+      <w:start w:val="1"/>
+      <w:numFmt w:val="bullet"/>
+      <w:lvlText w:val=""/>
+      <w:lvlJc w:val="left"/>
+      <w:pPr>
+        <w:tabs>
+          <w:tab w:val="num" w:pos="720"/>
+        </w:tabs>
+        <w:ind w:left="720" w:hanging="360"/>
+      </w:pPr>
+      <w:rPr>
+        <w:rFonts w:ascii="Symbol" w:hAnsi="Symbol" w:hint="default"/>
+        <w:sz w:val="20"/>
+      </w:rPr>
+    </w:lvl>
+    <w:lvl w:ilvl="1" w:tentative="1">
+      <w:start w:val="1"/>
+      <w:numFmt w:val="bullet"/>
+      <w:lvlText w:val=""/>
+      <w:lvlJc w:val="left"/>
+      <w:pPr>
+        <w:tabs>
+          <w:tab w:val="num" w:pos="1440"/>
+        </w:tabs>
+        <w:ind w:left="1440" w:hanging="360"/>
+      </w:pPr>
+      <w:rPr>
+        <w:rFonts w:ascii="Symbol" w:hAnsi="Symbol" w:hint="default"/>
+        <w:sz w:val="20"/>
+      </w:rPr>
+    </w:lvl>
+    <w:lvl w:ilvl="2" w:tentative="1">
+      <w:start w:val="1"/>
+      <w:numFmt w:val="bullet"/>
+      <w:lvlText w:val=""/>
+      <w:lvlJc w:val="left"/>
+      <w:pPr>
+        <w:tabs>
+          <w:tab w:val="num" w:pos="2160"/>
+        </w:tabs>
+        <w:ind w:left="2160" w:hanging="360"/>
+      </w:pPr>
+      <w:rPr>
+        <w:rFonts w:ascii="Symbol" w:hAnsi="Symbol" w:hint="default"/>
+        <w:sz w:val="20"/>
+      </w:rPr>
+    </w:lvl>
+    <w:lvl w:ilvl="3" w:tentative="1">
+      <w:start w:val="1"/>
+      <w:numFmt w:val="bullet"/>
+      <w:lvlText w:val=""/>
+      <w:lvlJc w:val="left"/>
+      <w:pPr>
+        <w:tabs>
+          <w:tab w:val="num" w:pos="2880"/>
+        </w:tabs>
+        <w:ind w:left="2880" w:hanging="360"/>
+      </w:pPr>
+      <w:rPr>
+        <w:rFonts w:ascii="Symbol" w:hAnsi="Symbol" w:hint="default"/>
+        <w:sz w:val="20"/>
+      </w:rPr>
+    </w:lvl>
+    <w:lvl w:ilvl="4" w:tentative="1">
+      <w:start w:val="1"/>
+      <w:numFmt w:val="bullet"/>
+      <w:lvlText w:val=""/>
+      <w:lvlJc w:val="left"/>
+      <w:pPr>
+        <w:tabs>
+          <w:tab w:val="num" w:pos="3600"/>
+        </w:tabs>
+        <w:ind w:left="3600" w:hanging="360"/>
+      </w:pPr>
+      <w:rPr>
+        <w:rFonts w:ascii="Symbol" w:hAnsi="Symbol" w:hint="default"/>
+        <w:sz w:val="20"/>
+      </w:rPr>
+    </w:lvl>
+    <w:lvl w:ilvl="5" w:tentative="1">
+      <w:start w:val="1"/>
+      <w:numFmt w:val="bullet"/>
+      <w:lvlText w:val=""/>
+      <w:lvlJc w:val="left"/>
+      <w:pPr>
+        <w:tabs>
+          <w:tab w:val="num" w:pos="4320"/>
+        </w:tabs>
+        <w:ind w:left="4320" w:hanging="360"/>
+      </w:pPr>
+      <w:rPr>
+        <w:rFonts w:ascii="Symbol" w:hAnsi="Symbol" w:hint="default"/>
+        <w:sz w:val="20"/>
+      </w:rPr>
+    </w:lvl>
+    <w:lvl w:ilvl="6" w:tentative="1">
+      <w:start w:val="1"/>
+      <w:numFmt w:val="bullet"/>
+      <w:lvlText w:val=""/>
+      <w:lvlJc w:val="left"/>
+      <w:pPr>
+        <w:tabs>
+          <w:tab w:val="num" w:pos="5040"/>
+        </w:tabs>
+        <w:ind w:left="5040" w:hanging="360"/>
+      </w:pPr>
+      <w:rPr>
+        <w:rFonts w:ascii="Symbol" w:hAnsi="Symbol" w:hint="default"/>
+        <w:sz w:val="20"/>
+      </w:rPr>
+    </w:lvl>
+    <w:lvl w:ilvl="7" w:tentative="1">
+      <w:start w:val="1"/>
+      <w:numFmt w:val="bullet"/>
+      <w:lvlText w:val=""/>
+      <w:lvlJc w:val="left"/>
+      <w:pPr>
+        <w:tabs>
+          <w:tab w:val="num" w:pos="5760"/>
+        </w:tabs>
+        <w:ind w:left="5760" w:hanging="360"/>
+      </w:pPr>
+      <w:rPr>
+        <w:rFonts w:ascii="Symbol" w:hAnsi="Symbol" w:hint="default"/>
+        <w:sz w:val="20"/>
+      </w:rPr>
+    </w:lvl>
+    <w:lvl w:ilvl="8" w:tentative="1">
+      <w:start w:val="1"/>
+      <w:numFmt w:val="bullet"/>
+      <w:lvlText w:val=""/>
+      <w:lvlJc w:val="left"/>
+      <w:pPr>
+        <w:tabs>
+          <w:tab w:val="num" w:pos="6480"/>
+        </w:tabs>
+        <w:ind w:left="6480" w:hanging="360"/>
+      </w:pPr>
+      <w:rPr>
+        <w:rFonts w:ascii="Symbol" w:hAnsi="Symbol" w:hint="default"/>
+        <w:sz w:val="20"/>
+      </w:rPr>
+    </w:lvl>
+  </w:abstractNum>
+  <w:num w:numId="1" w16cid:durableId="647981266">
+    <w:abstractNumId w:val="0"/>
+  </w:num>
+</w:numbering>
+</file>
+
 <file path=word/styles.xml><?xml version="1.0" encoding="utf-8"?>
-<w:styles xmlns:mc="http://schemas.openxmlformats.org/markup-compatibility/2006" xmlns:r="http://schemas.openxmlformats.org/officeDocument/2006/relationships" xmlns:w="http://schemas.openxmlformats.org/wordprocessingml/2006/main" xmlns:w14="http://schemas.microsoft.com/office/word/2010/wordml" xmlns:w15="http://schemas.microsoft.com/office/word/2012/wordml" xmlns:w16cex="http://schemas.microsoft.com/office/word/2018/wordml/cex" xmlns:w16cid="http://schemas.microsoft.com/office/word/2016/wordml/cid" xmlns:w16="http://schemas.microsoft.com/office/word/2018/wordml" xmlns:w16sdtdh="http://schemas.microsoft.com/office/word/2020/wordml/sdtdatahash" xmlns:w16sdtfl="http://schemas.microsoft.com/office/word/2024/wordml/sdtformatlock" xmlns:w16se="http://schemas.microsoft.com/office/word/2015/wordml/symex" xmlns:w16du="http://schemas.microsoft.com/office/word/2023/wordml/word16du" mc:Ignorable="w14 w15 w16se w16cid w16 w16cex w16sdtdh w16sdtfl w16du">
+<w:styles xmlns:mc="http://schemas.openxmlformats.org/markup-compatibility/2006" xmlns:r="http://schemas.openxmlformats.org/officeDocument/2006/relationships" xmlns:w="http://schemas.openxmlformats.org/wordprocessingml/2006/main" xmlns:w14="http://schemas.microsoft.com/office/word/2010/wordml" xmlns:w15="http://schemas.microsoft.com/office/word/2012/wordml" xmlns:w16cex="http://schemas.microsoft.com/office/word/2018/wordml/cex" xmlns:w16cid="http://schemas.microsoft.com/office/word/2016/wordml/cid" xmlns:w16="http://schemas.microsoft.com/office/word/2018/wordml" xmlns:w16du="http://schemas.microsoft.com/office/word/2023/wordml/word16du" xmlns:w16sdtdh="http://schemas.microsoft.com/office/word/2020/wordml/sdtdatahash" xmlns:w16sdtfl="http://schemas.microsoft.com/office/word/2024/wordml/sdtformatlock" xmlns:w16se="http://schemas.microsoft.com/office/word/2015/wordml/symex" mc:Ignorable="w14 w15 w16se w16cid w16 w16cex w16sdtdh w16sdtfl w16du">
   <w:docDefaults>
     <w:rPrDefault>
       <w:rPr>
@@ -1274,7 +1535,6 @@
   <w:style w:type="character" w:default="1" w:styleId="DefaultParagraphFont">
     <w:name w:val="Default Paragraph Font"/>
     <w:uiPriority w:val="1"/>
-    <w:semiHidden/>
     <w:unhideWhenUsed/>
   </w:style>
   <w:style w:type="table" w:default="1" w:styleId="TableNormal">

</xml_diff>